<commit_message>
modificaciones del informe tecnico
</commit_message>
<xml_diff>
--- a/Informe_Tecnico.docx
+++ b/Informe_Tecnico.docx
@@ -54,7 +54,7 @@
           <w:sz w:val="36"/>
           <w:szCs w:val="36"/>
         </w:rPr>
-        <w:t>Informe Técnico — Primer Parcial</w:t>
+        <w:t>Informe Técnico</w:t>
       </w:r>
     </w:p>
     <w:p>
@@ -68,25 +68,7 @@
           <w:sz w:val="26"/>
           <w:szCs w:val="26"/>
         </w:rPr>
-        <w:t xml:space="preserve">Proyecto </w:t>
-      </w:r>
-      <w:proofErr w:type="spellStart"/>
-      <w:r>
-        <w:rPr>
-          <w:color w:val="333333"/>
-          <w:sz w:val="26"/>
-          <w:szCs w:val="26"/>
-        </w:rPr>
-        <w:t>MLOps</w:t>
-      </w:r>
-      <w:proofErr w:type="spellEnd"/>
-      <w:r>
-        <w:rPr>
-          <w:color w:val="333333"/>
-          <w:sz w:val="26"/>
-          <w:szCs w:val="26"/>
-        </w:rPr>
-        <w:t xml:space="preserve"> Local: Predicción de Abandono de Clientes</w:t>
+        <w:t>Proyecto MLOps Local: Predicción de Abandono de Clientes</w:t>
       </w:r>
     </w:p>
     <w:p>
@@ -98,21 +80,7 @@
         <w:rPr>
           <w:color w:val="555555"/>
         </w:rPr>
-        <w:t xml:space="preserve">Empresa simulada: </w:t>
-      </w:r>
-      <w:proofErr w:type="spellStart"/>
-      <w:r>
-        <w:rPr>
-          <w:color w:val="555555"/>
-        </w:rPr>
-        <w:t>AndesLink</w:t>
-      </w:r>
-      <w:proofErr w:type="spellEnd"/>
-      <w:r>
-        <w:rPr>
-          <w:color w:val="555555"/>
-        </w:rPr>
-        <w:t xml:space="preserve"> Servicios Digitales S.A.</w:t>
+        <w:t>Empresa simulada: AndesLink Servicios Digitales S.A.</w:t>
       </w:r>
     </w:p>
     <w:p>
@@ -166,21 +134,8 @@
         <w:spacing w:after="120"/>
         <w:jc w:val="both"/>
       </w:pPr>
-      <w:proofErr w:type="spellStart"/>
-      <w:r>
-        <w:t>AndesLink</w:t>
-      </w:r>
-      <w:proofErr w:type="spellEnd"/>
-      <w:r>
-        <w:t xml:space="preserve"> Servicios Digitales S.A. es una empresa de suscripción mensual que ha detectado una tasa creciente de cancelación voluntaria de clientes (</w:t>
-      </w:r>
-      <w:proofErr w:type="spellStart"/>
-      <w:r>
-        <w:t>churn</w:t>
-      </w:r>
-      <w:proofErr w:type="spellEnd"/>
-      <w:r>
-        <w:t>) en los últimos trimestres. Esta situación impacta directamente en los ingresos recurrentes, el costo de adquisición de nuevos usuarios y la estabilidad del flujo de caja.</w:t>
+      <w:r>
+        <w:t>AndesLink Servicios Digitales S.A. es una empresa de suscripción mensual que ha detectado una tasa creciente de cancelación voluntaria de clientes (churn) en los últimos trimestres. Esta situación impacta directamente en los ingresos recurrentes, el costo de adquisición de nuevos usuarios y la estabilidad del flujo de caja.</w:t>
       </w:r>
     </w:p>
     <w:p>
@@ -189,23 +144,7 @@
         <w:jc w:val="both"/>
       </w:pPr>
       <w:r>
-        <w:t xml:space="preserve">El objetivo del proyecto es desarrollar un modelo de Machine </w:t>
-      </w:r>
-      <w:proofErr w:type="spellStart"/>
-      <w:r>
-        <w:t>Learning</w:t>
-      </w:r>
-      <w:proofErr w:type="spellEnd"/>
-      <w:r>
-        <w:t xml:space="preserve"> capaz de predecir, con anticipación suficiente, si un cliente abandonará el servicio en el corto plazo. Esta predicción permite activar campañas de retención focalizadas antes de que el cliente decida cancelar, reduciendo la tasa de </w:t>
-      </w:r>
-      <w:proofErr w:type="spellStart"/>
-      <w:r>
-        <w:t>churn</w:t>
-      </w:r>
-      <w:proofErr w:type="spellEnd"/>
-      <w:r>
-        <w:t xml:space="preserve"> de manera proactiva.</w:t>
+        <w:t>El objetivo del proyecto es desarrollar un modelo de Machine Learning capaz de predecir, con anticipación suficiente, si un cliente abandonará el servicio en el corto plazo. Esta predicción permite activar campañas de retención focalizadas antes de que el cliente decida cancelar, reduciendo la tasa de churn de manera proactiva.</w:t>
       </w:r>
     </w:p>
     <w:p>
@@ -221,23 +160,7 @@
         <w:spacing w:after="120"/>
       </w:pPr>
       <w:r>
-        <w:t xml:space="preserve">La variable </w:t>
-      </w:r>
-      <w:proofErr w:type="gramStart"/>
-      <w:r>
-        <w:t>target</w:t>
-      </w:r>
-      <w:proofErr w:type="gramEnd"/>
-      <w:r>
-        <w:t xml:space="preserve"> es </w:t>
-      </w:r>
-      <w:proofErr w:type="spellStart"/>
-      <w:r>
-        <w:t>churn</w:t>
-      </w:r>
-      <w:proofErr w:type="spellEnd"/>
-      <w:r>
-        <w:t>, de naturaleza binaria:</w:t>
+        <w:t>La variable target es churn, de naturaleza binaria:</w:t>
       </w:r>
     </w:p>
     <w:p>
@@ -277,23 +200,7 @@
         <w:jc w:val="both"/>
       </w:pPr>
       <w:r>
-        <w:t xml:space="preserve">Se trata de un problema de clasificación binaria supervisada. La métrica principal de evaluación es el ROC-AUC, complementada con </w:t>
-      </w:r>
-      <w:proofErr w:type="spellStart"/>
-      <w:r>
-        <w:t>recall</w:t>
-      </w:r>
-      <w:proofErr w:type="spellEnd"/>
-      <w:r>
-        <w:t xml:space="preserve">, dado que el costo de no detectar un </w:t>
-      </w:r>
-      <w:proofErr w:type="spellStart"/>
-      <w:r>
-        <w:t>churner</w:t>
-      </w:r>
-      <w:proofErr w:type="spellEnd"/>
-      <w:r>
-        <w:t xml:space="preserve"> real (falso negativo) es mayor que el costo de activar una campaña de retención innecesaria (falso positivo).</w:t>
+        <w:t>Se trata de un problema de clasificación binaria supervisada. La métrica principal de evaluación es el ROC-AUC, complementada con recall, dado que el costo de no detectar un churner real (falso negativo) es mayor que el costo de activar una campaña de retención innecesaria (falso positivo).</w:t>
       </w:r>
     </w:p>
     <w:p>
@@ -309,13 +216,8 @@
         </w:pBdr>
       </w:pPr>
       <w:r>
-        <w:t xml:space="preserve">2. </w:t>
-      </w:r>
-      <w:proofErr w:type="spellStart"/>
-      <w:r>
-        <w:t>Dataset</w:t>
-      </w:r>
-      <w:proofErr w:type="spellEnd"/>
+        <w:t>2. Dataset</w:t>
+      </w:r>
     </w:p>
     <w:p>
       <w:pPr>
@@ -331,23 +233,7 @@
         <w:jc w:val="both"/>
       </w:pPr>
       <w:r>
-        <w:t xml:space="preserve">Se utilizó un </w:t>
-      </w:r>
-      <w:proofErr w:type="spellStart"/>
-      <w:r>
-        <w:t>dataset</w:t>
-      </w:r>
-      <w:proofErr w:type="spellEnd"/>
-      <w:r>
-        <w:t xml:space="preserve"> sintético construido ad hoc para el proyecto. Esta decisión se tomó en ausencia de datos reales provistos por la cátedra, siguiendo la habilitación explícita de la consigna. El </w:t>
-      </w:r>
-      <w:proofErr w:type="spellStart"/>
-      <w:r>
-        <w:t>dataset</w:t>
-      </w:r>
-      <w:proofErr w:type="spellEnd"/>
-      <w:r>
-        <w:t xml:space="preserve"> fue diseñado para reflejar un escenario realista de empresa de suscripción, con variables de comportamiento, facturación, soporte y características del contrato.</w:t>
+        <w:t>Se utilizó un dataset sintético construido ad hoc para el proyecto. Esta decisión se tomó en ausencia de datos reales provistos por la cátedra, siguiendo la habilitación explícita de la consigna. El dataset fue diseñado para reflejar un escenario realista de empresa de suscripción, con variables de comportamiento, facturación, soporte y características del contrato.</w:t>
       </w:r>
     </w:p>
     <w:p>
@@ -380,12 +266,6 @@
         <w:gridCol w:w="6026"/>
       </w:tblGrid>
       <w:tr>
-        <w:tblPrEx>
-          <w:tblCellMar>
-            <w:top w:w="0" w:type="dxa"/>
-            <w:bottom w:w="0" w:type="dxa"/>
-          </w:tblCellMar>
-        </w:tblPrEx>
         <w:trPr>
           <w:tblHeader/>
         </w:trPr>
@@ -449,12 +329,6 @@
         </w:tc>
       </w:tr>
       <w:tr>
-        <w:tblPrEx>
-          <w:tblCellMar>
-            <w:top w:w="0" w:type="dxa"/>
-            <w:bottom w:w="0" w:type="dxa"/>
-          </w:tblCellMar>
-        </w:tblPrEx>
         <w:tc>
           <w:tcPr>
             <w:tcW w:w="3000" w:type="dxa"/>
@@ -511,12 +385,6 @@
         </w:tc>
       </w:tr>
       <w:tr>
-        <w:tblPrEx>
-          <w:tblCellMar>
-            <w:top w:w="0" w:type="dxa"/>
-            <w:bottom w:w="0" w:type="dxa"/>
-          </w:tblCellMar>
-        </w:tblPrEx>
         <w:tc>
           <w:tcPr>
             <w:tcW w:w="3000" w:type="dxa"/>
@@ -567,50 +435,12 @@
                 <w:sz w:val="20"/>
                 <w:szCs w:val="20"/>
               </w:rPr>
-              <w:t xml:space="preserve">16 (15 </w:t>
-            </w:r>
-            <w:proofErr w:type="spellStart"/>
-            <w:r>
-              <w:rPr>
-                <w:sz w:val="20"/>
-                <w:szCs w:val="20"/>
-              </w:rPr>
-              <w:t>features</w:t>
-            </w:r>
-            <w:proofErr w:type="spellEnd"/>
-            <w:r>
-              <w:rPr>
-                <w:sz w:val="20"/>
-                <w:szCs w:val="20"/>
-              </w:rPr>
-              <w:t xml:space="preserve"> + 1 </w:t>
-            </w:r>
-            <w:proofErr w:type="gramStart"/>
-            <w:r>
-              <w:rPr>
-                <w:sz w:val="20"/>
-                <w:szCs w:val="20"/>
-              </w:rPr>
-              <w:t>target</w:t>
-            </w:r>
-            <w:proofErr w:type="gramEnd"/>
-            <w:r>
-              <w:rPr>
-                <w:sz w:val="20"/>
-                <w:szCs w:val="20"/>
-              </w:rPr>
-              <w:t>)</w:t>
+              <w:t>16 (15 features + 1 target)</w:t>
             </w:r>
           </w:p>
         </w:tc>
       </w:tr>
       <w:tr>
-        <w:tblPrEx>
-          <w:tblCellMar>
-            <w:top w:w="0" w:type="dxa"/>
-            <w:bottom w:w="0" w:type="dxa"/>
-          </w:tblCellMar>
-        </w:tblPrEx>
         <w:tc>
           <w:tcPr>
             <w:tcW w:w="3000" w:type="dxa"/>
@@ -634,17 +464,8 @@
                 <w:sz w:val="20"/>
                 <w:szCs w:val="20"/>
               </w:rPr>
-              <w:t xml:space="preserve">Tasa de </w:t>
-            </w:r>
-            <w:proofErr w:type="spellStart"/>
-            <w:r>
-              <w:rPr>
-                <w:sz w:val="20"/>
-                <w:szCs w:val="20"/>
-              </w:rPr>
-              <w:t>churn</w:t>
-            </w:r>
-            <w:proofErr w:type="spellEnd"/>
+              <w:t>Tasa de churn</w:t>
+            </w:r>
           </w:p>
         </w:tc>
         <w:tc>
@@ -676,12 +497,6 @@
         </w:tc>
       </w:tr>
       <w:tr>
-        <w:tblPrEx>
-          <w:tblCellMar>
-            <w:top w:w="0" w:type="dxa"/>
-            <w:bottom w:w="0" w:type="dxa"/>
-          </w:tblCellMar>
-        </w:tblPrEx>
         <w:tc>
           <w:tcPr>
             <w:tcW w:w="3000" w:type="dxa"/>
@@ -738,12 +553,6 @@
         </w:tc>
       </w:tr>
       <w:tr>
-        <w:tblPrEx>
-          <w:tblCellMar>
-            <w:top w:w="0" w:type="dxa"/>
-            <w:bottom w:w="0" w:type="dxa"/>
-          </w:tblCellMar>
-        </w:tblPrEx>
         <w:tc>
           <w:tcPr>
             <w:tcW w:w="3000" w:type="dxa"/>
@@ -810,13 +619,8 @@
         <w:pStyle w:val="Ttulo2"/>
       </w:pPr>
       <w:r>
-        <w:t xml:space="preserve">2.3 Variables del </w:t>
-      </w:r>
-      <w:proofErr w:type="spellStart"/>
-      <w:r>
-        <w:t>Dataset</w:t>
-      </w:r>
-      <w:proofErr w:type="spellEnd"/>
+        <w:t>2.3 Variables del Dataset</w:t>
+      </w:r>
     </w:p>
     <w:tbl>
       <w:tblPr>
@@ -841,12 +645,6 @@
         <w:gridCol w:w="4426"/>
       </w:tblGrid>
       <w:tr>
-        <w:tblPrEx>
-          <w:tblCellMar>
-            <w:top w:w="0" w:type="dxa"/>
-            <w:bottom w:w="0" w:type="dxa"/>
-          </w:tblCellMar>
-        </w:tblPrEx>
         <w:trPr>
           <w:tblHeader/>
         </w:trPr>
@@ -939,12 +737,6 @@
         </w:tc>
       </w:tr>
       <w:tr>
-        <w:tblPrEx>
-          <w:tblCellMar>
-            <w:top w:w="0" w:type="dxa"/>
-            <w:bottom w:w="0" w:type="dxa"/>
-          </w:tblCellMar>
-        </w:tblPrEx>
         <w:tc>
           <w:tcPr>
             <w:tcW w:w="2800" w:type="dxa"/>
@@ -963,7 +755,6 @@
             </w:tcMar>
           </w:tcPr>
           <w:p>
-            <w:proofErr w:type="spellStart"/>
             <w:r>
               <w:rPr>
                 <w:sz w:val="20"/>
@@ -971,7 +762,6 @@
               </w:rPr>
               <w:t>tenure_months</w:t>
             </w:r>
-            <w:proofErr w:type="spellEnd"/>
           </w:p>
         </w:tc>
         <w:tc>
@@ -1030,12 +820,6 @@
         </w:tc>
       </w:tr>
       <w:tr>
-        <w:tblPrEx>
-          <w:tblCellMar>
-            <w:top w:w="0" w:type="dxa"/>
-            <w:bottom w:w="0" w:type="dxa"/>
-          </w:tblCellMar>
-        </w:tblPrEx>
         <w:tc>
           <w:tcPr>
             <w:tcW w:w="2800" w:type="dxa"/>
@@ -1054,7 +838,6 @@
             </w:tcMar>
           </w:tcPr>
           <w:p>
-            <w:proofErr w:type="spellStart"/>
             <w:r>
               <w:rPr>
                 <w:sz w:val="20"/>
@@ -1063,7 +846,6 @@
               <w:lastRenderedPageBreak/>
               <w:t>monthly_charge</w:t>
             </w:r>
-            <w:proofErr w:type="spellEnd"/>
           </w:p>
         </w:tc>
         <w:tc>
@@ -1122,12 +904,6 @@
         </w:tc>
       </w:tr>
       <w:tr>
-        <w:tblPrEx>
-          <w:tblCellMar>
-            <w:top w:w="0" w:type="dxa"/>
-            <w:bottom w:w="0" w:type="dxa"/>
-          </w:tblCellMar>
-        </w:tblPrEx>
         <w:tc>
           <w:tcPr>
             <w:tcW w:w="2800" w:type="dxa"/>
@@ -1146,7 +922,6 @@
             </w:tcMar>
           </w:tcPr>
           <w:p>
-            <w:proofErr w:type="spellStart"/>
             <w:r>
               <w:rPr>
                 <w:sz w:val="20"/>
@@ -1154,7 +929,6 @@
               </w:rPr>
               <w:t>total_charges</w:t>
             </w:r>
-            <w:proofErr w:type="spellEnd"/>
           </w:p>
         </w:tc>
         <w:tc>
@@ -1213,12 +987,6 @@
         </w:tc>
       </w:tr>
       <w:tr>
-        <w:tblPrEx>
-          <w:tblCellMar>
-            <w:top w:w="0" w:type="dxa"/>
-            <w:bottom w:w="0" w:type="dxa"/>
-          </w:tblCellMar>
-        </w:tblPrEx>
         <w:tc>
           <w:tcPr>
             <w:tcW w:w="2800" w:type="dxa"/>
@@ -1237,24 +1005,13 @@
             </w:tcMar>
           </w:tcPr>
           <w:p>
-            <w:proofErr w:type="spellStart"/>
-            <w:r>
-              <w:rPr>
-                <w:sz w:val="20"/>
-                <w:szCs w:val="20"/>
-              </w:rPr>
-              <w:t>support_</w:t>
-            </w:r>
-            <w:proofErr w:type="gramStart"/>
-            <w:r>
-              <w:rPr>
-                <w:sz w:val="20"/>
-                <w:szCs w:val="20"/>
-              </w:rPr>
-              <w:t>tickets</w:t>
-            </w:r>
-            <w:proofErr w:type="spellEnd"/>
-            <w:proofErr w:type="gramEnd"/>
+            <w:r>
+              <w:rPr>
+                <w:sz w:val="20"/>
+                <w:szCs w:val="20"/>
+              </w:rPr>
+              <w:t>support_tickets</w:t>
+            </w:r>
           </w:p>
         </w:tc>
         <w:tc>
@@ -1302,32 +1059,17 @@
             </w:tcMar>
           </w:tcPr>
           <w:p>
-            <w:proofErr w:type="gramStart"/>
-            <w:r>
-              <w:rPr>
-                <w:sz w:val="20"/>
-                <w:szCs w:val="20"/>
-              </w:rPr>
-              <w:t>Tickets</w:t>
-            </w:r>
-            <w:proofErr w:type="gramEnd"/>
-            <w:r>
-              <w:rPr>
-                <w:sz w:val="20"/>
-                <w:szCs w:val="20"/>
-              </w:rPr>
-              <w:t xml:space="preserve"> de soporte abiertos</w:t>
+            <w:r>
+              <w:rPr>
+                <w:sz w:val="20"/>
+                <w:szCs w:val="20"/>
+              </w:rPr>
+              <w:t>Tickets de soporte abiertos</w:t>
             </w:r>
           </w:p>
         </w:tc>
       </w:tr>
       <w:tr>
-        <w:tblPrEx>
-          <w:tblCellMar>
-            <w:top w:w="0" w:type="dxa"/>
-            <w:bottom w:w="0" w:type="dxa"/>
-          </w:tblCellMar>
-        </w:tblPrEx>
         <w:tc>
           <w:tcPr>
             <w:tcW w:w="2800" w:type="dxa"/>
@@ -1346,7 +1088,6 @@
             </w:tcMar>
           </w:tcPr>
           <w:p>
-            <w:proofErr w:type="spellStart"/>
             <w:r>
               <w:rPr>
                 <w:sz w:val="20"/>
@@ -1354,7 +1095,6 @@
               </w:rPr>
               <w:t>late_payments</w:t>
             </w:r>
-            <w:proofErr w:type="spellEnd"/>
           </w:p>
         </w:tc>
         <w:tc>
@@ -1413,12 +1153,6 @@
         </w:tc>
       </w:tr>
       <w:tr>
-        <w:tblPrEx>
-          <w:tblCellMar>
-            <w:top w:w="0" w:type="dxa"/>
-            <w:bottom w:w="0" w:type="dxa"/>
-          </w:tblCellMar>
-        </w:tblPrEx>
         <w:tc>
           <w:tcPr>
             <w:tcW w:w="2800" w:type="dxa"/>
@@ -1437,7 +1171,6 @@
             </w:tcMar>
           </w:tcPr>
           <w:p>
-            <w:proofErr w:type="spellStart"/>
             <w:r>
               <w:rPr>
                 <w:sz w:val="20"/>
@@ -1445,7 +1178,6 @@
               </w:rPr>
               <w:t>avg_monthly_usage_gb</w:t>
             </w:r>
-            <w:proofErr w:type="spellEnd"/>
           </w:p>
         </w:tc>
         <w:tc>
@@ -1504,12 +1236,6 @@
         </w:tc>
       </w:tr>
       <w:tr>
-        <w:tblPrEx>
-          <w:tblCellMar>
-            <w:top w:w="0" w:type="dxa"/>
-            <w:bottom w:w="0" w:type="dxa"/>
-          </w:tblCellMar>
-        </w:tblPrEx>
         <w:tc>
           <w:tcPr>
             <w:tcW w:w="2800" w:type="dxa"/>
@@ -1528,7 +1254,6 @@
             </w:tcMar>
           </w:tcPr>
           <w:p>
-            <w:proofErr w:type="spellStart"/>
             <w:r>
               <w:rPr>
                 <w:sz w:val="20"/>
@@ -1536,7 +1261,6 @@
               </w:rPr>
               <w:t>num_products</w:t>
             </w:r>
-            <w:proofErr w:type="spellEnd"/>
           </w:p>
         </w:tc>
         <w:tc>
@@ -1595,12 +1319,6 @@
         </w:tc>
       </w:tr>
       <w:tr>
-        <w:tblPrEx>
-          <w:tblCellMar>
-            <w:top w:w="0" w:type="dxa"/>
-            <w:bottom w:w="0" w:type="dxa"/>
-          </w:tblCellMar>
-        </w:tblPrEx>
         <w:tc>
           <w:tcPr>
             <w:tcW w:w="2800" w:type="dxa"/>
@@ -1619,7 +1337,6 @@
             </w:tcMar>
           </w:tcPr>
           <w:p>
-            <w:proofErr w:type="spellStart"/>
             <w:r>
               <w:rPr>
                 <w:sz w:val="20"/>
@@ -1627,7 +1344,6 @@
               </w:rPr>
               <w:t>customer_age</w:t>
             </w:r>
-            <w:proofErr w:type="spellEnd"/>
           </w:p>
         </w:tc>
         <w:tc>
@@ -1686,12 +1402,6 @@
         </w:tc>
       </w:tr>
       <w:tr>
-        <w:tblPrEx>
-          <w:tblCellMar>
-            <w:top w:w="0" w:type="dxa"/>
-            <w:bottom w:w="0" w:type="dxa"/>
-          </w:tblCellMar>
-        </w:tblPrEx>
         <w:tc>
           <w:tcPr>
             <w:tcW w:w="2800" w:type="dxa"/>
@@ -1710,7 +1420,6 @@
             </w:tcMar>
           </w:tcPr>
           <w:p>
-            <w:proofErr w:type="spellStart"/>
             <w:r>
               <w:rPr>
                 <w:sz w:val="20"/>
@@ -1718,7 +1427,6 @@
               </w:rPr>
               <w:t>has_streaming</w:t>
             </w:r>
-            <w:proofErr w:type="spellEnd"/>
           </w:p>
         </w:tc>
         <w:tc>
@@ -1771,34 +1479,12 @@
                 <w:sz w:val="20"/>
                 <w:szCs w:val="20"/>
               </w:rPr>
-              <w:t xml:space="preserve">Tiene servicio de </w:t>
-            </w:r>
-            <w:proofErr w:type="spellStart"/>
-            <w:r>
-              <w:rPr>
-                <w:sz w:val="20"/>
-                <w:szCs w:val="20"/>
-              </w:rPr>
-              <w:t>streaming</w:t>
-            </w:r>
-            <w:proofErr w:type="spellEnd"/>
-            <w:r>
-              <w:rPr>
-                <w:sz w:val="20"/>
-                <w:szCs w:val="20"/>
-              </w:rPr>
-              <w:t xml:space="preserve"> (0/1)</w:t>
+              <w:t>Tiene servicio de streaming (0/1)</w:t>
             </w:r>
           </w:p>
         </w:tc>
       </w:tr>
       <w:tr>
-        <w:tblPrEx>
-          <w:tblCellMar>
-            <w:top w:w="0" w:type="dxa"/>
-            <w:bottom w:w="0" w:type="dxa"/>
-          </w:tblCellMar>
-        </w:tblPrEx>
         <w:tc>
           <w:tcPr>
             <w:tcW w:w="2800" w:type="dxa"/>
@@ -1817,7 +1503,6 @@
             </w:tcMar>
           </w:tcPr>
           <w:p>
-            <w:proofErr w:type="spellStart"/>
             <w:r>
               <w:rPr>
                 <w:sz w:val="20"/>
@@ -1825,7 +1510,6 @@
               </w:rPr>
               <w:t>has_security_pack</w:t>
             </w:r>
-            <w:proofErr w:type="spellEnd"/>
           </w:p>
         </w:tc>
         <w:tc>
@@ -1884,12 +1568,6 @@
         </w:tc>
       </w:tr>
       <w:tr>
-        <w:tblPrEx>
-          <w:tblCellMar>
-            <w:top w:w="0" w:type="dxa"/>
-            <w:bottom w:w="0" w:type="dxa"/>
-          </w:tblCellMar>
-        </w:tblPrEx>
         <w:tc>
           <w:tcPr>
             <w:tcW w:w="2800" w:type="dxa"/>
@@ -1908,7 +1586,6 @@
             </w:tcMar>
           </w:tcPr>
           <w:p>
-            <w:proofErr w:type="spellStart"/>
             <w:r>
               <w:rPr>
                 <w:sz w:val="20"/>
@@ -1916,7 +1593,6 @@
               </w:rPr>
               <w:t>is_promo</w:t>
             </w:r>
-            <w:proofErr w:type="spellEnd"/>
           </w:p>
         </w:tc>
         <w:tc>
@@ -1975,12 +1651,6 @@
         </w:tc>
       </w:tr>
       <w:tr>
-        <w:tblPrEx>
-          <w:tblCellMar>
-            <w:top w:w="0" w:type="dxa"/>
-            <w:bottom w:w="0" w:type="dxa"/>
-          </w:tblCellMar>
-        </w:tblPrEx>
         <w:tc>
           <w:tcPr>
             <w:tcW w:w="2800" w:type="dxa"/>
@@ -1999,7 +1669,6 @@
             </w:tcMar>
           </w:tcPr>
           <w:p>
-            <w:proofErr w:type="spellStart"/>
             <w:r>
               <w:rPr>
                 <w:sz w:val="20"/>
@@ -2007,7 +1676,6 @@
               </w:rPr>
               <w:t>contract_type</w:t>
             </w:r>
-            <w:proofErr w:type="spellEnd"/>
           </w:p>
         </w:tc>
         <w:tc>
@@ -2066,12 +1734,6 @@
         </w:tc>
       </w:tr>
       <w:tr>
-        <w:tblPrEx>
-          <w:tblCellMar>
-            <w:top w:w="0" w:type="dxa"/>
-            <w:bottom w:w="0" w:type="dxa"/>
-          </w:tblCellMar>
-        </w:tblPrEx>
         <w:tc>
           <w:tcPr>
             <w:tcW w:w="2800" w:type="dxa"/>
@@ -2090,7 +1752,6 @@
             </w:tcMar>
           </w:tcPr>
           <w:p>
-            <w:proofErr w:type="spellStart"/>
             <w:r>
               <w:rPr>
                 <w:sz w:val="20"/>
@@ -2098,7 +1759,6 @@
               </w:rPr>
               <w:t>payment_method</w:t>
             </w:r>
-            <w:proofErr w:type="spellEnd"/>
           </w:p>
         </w:tc>
         <w:tc>
@@ -2151,27 +1811,12 @@
                 <w:sz w:val="20"/>
                 <w:szCs w:val="20"/>
               </w:rPr>
-              <w:t xml:space="preserve">transferencia / debito / efectivo / </w:t>
-            </w:r>
-            <w:proofErr w:type="spellStart"/>
-            <w:r>
-              <w:rPr>
-                <w:sz w:val="20"/>
-                <w:szCs w:val="20"/>
-              </w:rPr>
-              <w:t>credito</w:t>
-            </w:r>
-            <w:proofErr w:type="spellEnd"/>
+              <w:t>transferencia / debito / efectivo / credito</w:t>
+            </w:r>
           </w:p>
         </w:tc>
       </w:tr>
       <w:tr>
-        <w:tblPrEx>
-          <w:tblCellMar>
-            <w:top w:w="0" w:type="dxa"/>
-            <w:bottom w:w="0" w:type="dxa"/>
-          </w:tblCellMar>
-        </w:tblPrEx>
         <w:tc>
           <w:tcPr>
             <w:tcW w:w="2800" w:type="dxa"/>
@@ -2190,7 +1835,6 @@
             </w:tcMar>
           </w:tcPr>
           <w:p>
-            <w:proofErr w:type="spellStart"/>
             <w:r>
               <w:rPr>
                 <w:sz w:val="20"/>
@@ -2198,7 +1842,6 @@
               </w:rPr>
               <w:t>internet_service</w:t>
             </w:r>
-            <w:proofErr w:type="spellEnd"/>
           </w:p>
         </w:tc>
         <w:tc>
@@ -2251,34 +1894,12 @@
                 <w:sz w:val="20"/>
                 <w:szCs w:val="20"/>
               </w:rPr>
-              <w:t xml:space="preserve">cable / fibra / </w:t>
-            </w:r>
-            <w:proofErr w:type="spellStart"/>
-            <w:r>
-              <w:rPr>
-                <w:sz w:val="20"/>
-                <w:szCs w:val="20"/>
-              </w:rPr>
-              <w:t>movil</w:t>
-            </w:r>
-            <w:proofErr w:type="spellEnd"/>
-            <w:r>
-              <w:rPr>
-                <w:sz w:val="20"/>
-                <w:szCs w:val="20"/>
-              </w:rPr>
-              <w:t xml:space="preserve"> / ninguno</w:t>
+              <w:t>cable / fibra / movil / ninguno</w:t>
             </w:r>
           </w:p>
         </w:tc>
       </w:tr>
       <w:tr>
-        <w:tblPrEx>
-          <w:tblCellMar>
-            <w:top w:w="0" w:type="dxa"/>
-            <w:bottom w:w="0" w:type="dxa"/>
-          </w:tblCellMar>
-        </w:tblPrEx>
         <w:tc>
           <w:tcPr>
             <w:tcW w:w="2800" w:type="dxa"/>
@@ -2297,7 +1918,6 @@
             </w:tcMar>
           </w:tcPr>
           <w:p>
-            <w:proofErr w:type="spellStart"/>
             <w:r>
               <w:rPr>
                 <w:sz w:val="20"/>
@@ -2305,7 +1925,6 @@
               </w:rPr>
               <w:t>region</w:t>
             </w:r>
-            <w:proofErr w:type="spellEnd"/>
           </w:p>
         </w:tc>
         <w:tc>
@@ -2364,12 +1983,6 @@
         </w:tc>
       </w:tr>
       <w:tr>
-        <w:tblPrEx>
-          <w:tblCellMar>
-            <w:top w:w="0" w:type="dxa"/>
-            <w:bottom w:w="0" w:type="dxa"/>
-          </w:tblCellMar>
-        </w:tblPrEx>
         <w:tc>
           <w:tcPr>
             <w:tcW w:w="2800" w:type="dxa"/>
@@ -2388,7 +2001,6 @@
             </w:tcMar>
           </w:tcPr>
           <w:p>
-            <w:proofErr w:type="spellStart"/>
             <w:r>
               <w:rPr>
                 <w:sz w:val="20"/>
@@ -2396,7 +2008,6 @@
               </w:rPr>
               <w:t>churn</w:t>
             </w:r>
-            <w:proofErr w:type="spellEnd"/>
           </w:p>
         </w:tc>
         <w:tc>
@@ -2477,25 +2088,7 @@
         <w:jc w:val="both"/>
       </w:pPr>
       <w:r>
-        <w:t xml:space="preserve">Se realizó un análisis exploratorio completo documentado en el notebook </w:t>
-      </w:r>
-      <w:proofErr w:type="spellStart"/>
-      <w:proofErr w:type="gramStart"/>
-      <w:r>
-        <w:t>eda.ipynb</w:t>
-      </w:r>
-      <w:proofErr w:type="spellEnd"/>
-      <w:proofErr w:type="gramEnd"/>
-      <w:r>
-        <w:t xml:space="preserve">, con los resultados guardados en </w:t>
-      </w:r>
-      <w:proofErr w:type="spellStart"/>
-      <w:r>
-        <w:t>reports</w:t>
-      </w:r>
-      <w:proofErr w:type="spellEnd"/>
-      <w:r>
-        <w:t>/figures/. Los hallazgos principales se resumen a continuación.</w:t>
+        <w:t>Se realizó un análisis exploratorio completo documentado en el notebook eda.ipynb, con los resultados guardados en reports/figures/. Los hallazgos principales se resumen a continuación.</w:t>
       </w:r>
     </w:p>
     <w:p>
@@ -2512,39 +2105,7 @@
         <w:jc w:val="both"/>
       </w:pPr>
       <w:r>
-        <w:t xml:space="preserve">La tasa de </w:t>
-      </w:r>
-      <w:proofErr w:type="spellStart"/>
-      <w:r>
-        <w:t>churn</w:t>
-      </w:r>
-      <w:proofErr w:type="spellEnd"/>
-      <w:r>
-        <w:t xml:space="preserve"> es del 34%, lo que representa un desbalance moderado pero manejable. Se decidió utilizar </w:t>
-      </w:r>
-      <w:proofErr w:type="spellStart"/>
-      <w:r>
-        <w:t>class_weight</w:t>
-      </w:r>
-      <w:proofErr w:type="spellEnd"/>
-      <w:r>
-        <w:t>='</w:t>
-      </w:r>
-      <w:proofErr w:type="spellStart"/>
-      <w:r>
-        <w:t>balanced</w:t>
-      </w:r>
-      <w:proofErr w:type="spellEnd"/>
-      <w:r>
-        <w:t xml:space="preserve">' en ambos modelos para compensar esta diferencia sin necesidad de técnicas de </w:t>
-      </w:r>
-      <w:proofErr w:type="spellStart"/>
-      <w:r>
-        <w:t>oversampling</w:t>
-      </w:r>
-      <w:proofErr w:type="spellEnd"/>
-      <w:r>
-        <w:t>.</w:t>
+        <w:t>La tasa de churn es del 34%, lo que representa un desbalance moderado pero manejable. Se decidió utilizar class_weight='balanced' en ambos modelos para compensar esta diferencia sin necesidad de técnicas de oversampling.</w:t>
       </w:r>
     </w:p>
     <w:p>
@@ -2564,21 +2125,8 @@
         </w:numPr>
         <w:spacing w:after="80"/>
       </w:pPr>
-      <w:proofErr w:type="spellStart"/>
-      <w:r>
-        <w:t>tenure_months</w:t>
-      </w:r>
-      <w:proofErr w:type="spellEnd"/>
-      <w:r>
-        <w:t xml:space="preserve">: correlación negativa fuerte. A mayor antigüedad, menor probabilidad de </w:t>
-      </w:r>
-      <w:proofErr w:type="spellStart"/>
-      <w:r>
-        <w:t>churn</w:t>
-      </w:r>
-      <w:proofErr w:type="spellEnd"/>
-      <w:r>
-        <w:t>.</w:t>
+      <w:r>
+        <w:t>tenure_months: correlación negativa fuerte. A mayor antigüedad, menor probabilidad de churn.</w:t>
       </w:r>
     </w:p>
     <w:p>
@@ -2590,13 +2138,8 @@
         </w:numPr>
         <w:spacing w:after="80"/>
       </w:pPr>
-      <w:proofErr w:type="spellStart"/>
-      <w:r>
-        <w:t>total_charges</w:t>
-      </w:r>
-      <w:proofErr w:type="spellEnd"/>
-      <w:r>
-        <w:t>: correlación negativa. Clientes con mayor facturación acumulada tienden a quedarse.</w:t>
+      <w:r>
+        <w:t>total_charges: correlación negativa. Clientes con mayor facturación acumulada tienden a quedarse.</w:t>
       </w:r>
     </w:p>
     <w:p>
@@ -2608,34 +2151,8 @@
         </w:numPr>
         <w:spacing w:after="80"/>
       </w:pPr>
-      <w:proofErr w:type="spellStart"/>
-      <w:r>
-        <w:t>support_</w:t>
-      </w:r>
-      <w:proofErr w:type="gramStart"/>
-      <w:r>
-        <w:t>tickets</w:t>
-      </w:r>
-      <w:proofErr w:type="spellEnd"/>
-      <w:proofErr w:type="gramEnd"/>
-      <w:r>
-        <w:t xml:space="preserve">: correlación positiva. Más </w:t>
-      </w:r>
-      <w:proofErr w:type="gramStart"/>
-      <w:r>
-        <w:t>tickets</w:t>
-      </w:r>
-      <w:proofErr w:type="gramEnd"/>
-      <w:r>
-        <w:t xml:space="preserve"> de soporte se asocia con mayor </w:t>
-      </w:r>
-      <w:proofErr w:type="spellStart"/>
-      <w:r>
-        <w:t>churn</w:t>
-      </w:r>
-      <w:proofErr w:type="spellEnd"/>
-      <w:r>
-        <w:t>.</w:t>
+      <w:r>
+        <w:t>support_tickets: correlación positiva. Más tickets de soporte se asocia con mayor churn.</w:t>
       </w:r>
     </w:p>
     <w:p>
@@ -2647,13 +2164,8 @@
         </w:numPr>
         <w:spacing w:after="80"/>
       </w:pPr>
-      <w:proofErr w:type="spellStart"/>
-      <w:r>
-        <w:t>late_payments</w:t>
-      </w:r>
-      <w:proofErr w:type="spellEnd"/>
-      <w:r>
-        <w:t>: correlación positiva. Los pagos atrasados son un indicador de riesgo.</w:t>
+      <w:r>
+        <w:t>late_payments: correlación positiva. Los pagos atrasados son un indicador de riesgo.</w:t>
       </w:r>
     </w:p>
     <w:p>
@@ -2665,21 +2177,8 @@
         </w:numPr>
         <w:spacing w:after="80"/>
       </w:pPr>
-      <w:proofErr w:type="spellStart"/>
-      <w:r>
-        <w:t>contract_type</w:t>
-      </w:r>
-      <w:proofErr w:type="spellEnd"/>
-      <w:r>
-        <w:t xml:space="preserve">: los contratos mensuales presentan tasa de </w:t>
-      </w:r>
-      <w:proofErr w:type="spellStart"/>
-      <w:r>
-        <w:t>churn</w:t>
-      </w:r>
-      <w:proofErr w:type="spellEnd"/>
-      <w:r>
-        <w:t xml:space="preserve"> significativamente mayor que los anuales o bianuales.</w:t>
+      <w:r>
+        <w:t>contract_type: los contratos mensuales presentan tasa de churn significativamente mayor que los anuales o bianuales.</w:t>
       </w:r>
     </w:p>
     <w:p>
@@ -2687,13 +2186,8 @@
         <w:pStyle w:val="Ttulo2"/>
       </w:pPr>
       <w:r>
-        <w:t xml:space="preserve">3.3 Limitaciones del </w:t>
-      </w:r>
-      <w:proofErr w:type="spellStart"/>
-      <w:r>
-        <w:t>Dataset</w:t>
-      </w:r>
-      <w:proofErr w:type="spellEnd"/>
+        <w:t>3.3 Limitaciones del Dataset</w:t>
+      </w:r>
     </w:p>
     <w:p>
       <w:pPr>
@@ -2732,15 +2226,7 @@
         <w:spacing w:after="80"/>
       </w:pPr>
       <w:r>
-        <w:t xml:space="preserve">La variable </w:t>
-      </w:r>
-      <w:proofErr w:type="spellStart"/>
-      <w:r>
-        <w:t>region</w:t>
-      </w:r>
-      <w:proofErr w:type="spellEnd"/>
-      <w:r>
-        <w:t xml:space="preserve"> no mostró diferencias significativas entre categorías, por lo que su poder predictivo es limitado.</w:t>
+        <w:t>La variable region no mostró diferencias significativas entre categorías, por lo que su poder predictivo es limitado.</w:t>
       </w:r>
     </w:p>
     <w:p>
@@ -2773,15 +2259,7 @@
         <w:jc w:val="both"/>
       </w:pPr>
       <w:r>
-        <w:t xml:space="preserve">El </w:t>
-      </w:r>
-      <w:proofErr w:type="spellStart"/>
-      <w:r>
-        <w:t>dataset</w:t>
-      </w:r>
-      <w:proofErr w:type="spellEnd"/>
-      <w:r>
-        <w:t xml:space="preserve"> no presentó valores faltantes ni duplicados, por lo que no fue necesario aplicar imputación ni eliminación de registros. Se verificó la consistencia de tipos de datos en todas las columnas antes del preprocesamiento.</w:t>
+        <w:t>El dataset no presentó valores faltantes ni duplicados, por lo que no fue necesario aplicar imputación ni eliminación de registros. Se verificó la consistencia de tipos de datos en todas las columnas antes del preprocesamiento.</w:t>
       </w:r>
     </w:p>
     <w:p>
@@ -2797,31 +2275,7 @@
         <w:spacing w:after="120"/>
       </w:pPr>
       <w:r>
-        <w:t xml:space="preserve">Se implementó un </w:t>
-      </w:r>
-      <w:proofErr w:type="spellStart"/>
-      <w:r>
-        <w:t>ColumnTransformer</w:t>
-      </w:r>
-      <w:proofErr w:type="spellEnd"/>
-      <w:r>
-        <w:t xml:space="preserve"> de </w:t>
-      </w:r>
-      <w:proofErr w:type="spellStart"/>
-      <w:r>
-        <w:t>scikit-learn</w:t>
-      </w:r>
-      <w:proofErr w:type="spellEnd"/>
-      <w:r>
-        <w:t xml:space="preserve"> con tres ramas, ajustado exclusivamente sobre el conjunto de entrenamiento para evitar data </w:t>
-      </w:r>
-      <w:proofErr w:type="spellStart"/>
-      <w:r>
-        <w:t>leakage</w:t>
-      </w:r>
-      <w:proofErr w:type="spellEnd"/>
-      <w:r>
-        <w:t>:</w:t>
+        <w:t>Se implementó un ColumnTransformer de scikit-learn con tres ramas, ajustado exclusivamente sobre el conjunto de entrenamiento para evitar data leakage:</w:t>
       </w:r>
     </w:p>
     <w:p>
@@ -2834,15 +2288,7 @@
         <w:spacing w:after="80"/>
       </w:pPr>
       <w:r>
-        <w:t xml:space="preserve">Variables numéricas (8): </w:t>
-      </w:r>
-      <w:proofErr w:type="spellStart"/>
-      <w:r>
-        <w:t>StandardScaler</w:t>
-      </w:r>
-      <w:proofErr w:type="spellEnd"/>
-      <w:r>
-        <w:t xml:space="preserve"> — media 0, desvío 1.</w:t>
+        <w:t>Variables numéricas (8): StandardScaler — media 0, desvío 1.</w:t>
       </w:r>
     </w:p>
     <w:p>
@@ -2855,15 +2301,7 @@
         <w:spacing w:after="80"/>
       </w:pPr>
       <w:r>
-        <w:t xml:space="preserve">Variables binarias (3): </w:t>
-      </w:r>
-      <w:proofErr w:type="spellStart"/>
-      <w:r>
-        <w:t>passthrough</w:t>
-      </w:r>
-      <w:proofErr w:type="spellEnd"/>
-      <w:r>
-        <w:t xml:space="preserve"> — sin transformación, ya son 0/1.</w:t>
+        <w:t>Variables binarias (3): passthrough — sin transformación, ya son 0/1.</w:t>
       </w:r>
     </w:p>
     <w:p>
@@ -2876,31 +2314,7 @@
         <w:spacing w:after="80"/>
       </w:pPr>
       <w:r>
-        <w:t xml:space="preserve">Variables categóricas (4): </w:t>
-      </w:r>
-      <w:proofErr w:type="spellStart"/>
-      <w:r>
-        <w:t>OneHotEncoder</w:t>
-      </w:r>
-      <w:proofErr w:type="spellEnd"/>
-      <w:r>
-        <w:t xml:space="preserve"> con </w:t>
-      </w:r>
-      <w:proofErr w:type="spellStart"/>
-      <w:r>
-        <w:t>drop</w:t>
-      </w:r>
-      <w:proofErr w:type="spellEnd"/>
-      <w:r>
-        <w:t>='</w:t>
-      </w:r>
-      <w:proofErr w:type="spellStart"/>
-      <w:r>
-        <w:t>first</w:t>
-      </w:r>
-      <w:proofErr w:type="spellEnd"/>
-      <w:r>
-        <w:t>' para evitar multicolinealidad.</w:t>
+        <w:t>Variables categóricas (4): OneHotEncoder con drop='first' para evitar multicolinealidad.</w:t>
       </w:r>
     </w:p>
     <w:p>
@@ -2914,23 +2328,7 @@
         <w:jc w:val="both"/>
       </w:pPr>
       <w:r>
-        <w:t xml:space="preserve">El preprocesador fue serializado en </w:t>
-      </w:r>
-      <w:proofErr w:type="spellStart"/>
-      <w:r>
-        <w:t>models</w:t>
-      </w:r>
-      <w:proofErr w:type="spellEnd"/>
-      <w:r>
-        <w:t>/</w:t>
-      </w:r>
-      <w:proofErr w:type="spellStart"/>
-      <w:r>
-        <w:t>preprocessor.joblib</w:t>
-      </w:r>
-      <w:proofErr w:type="spellEnd"/>
-      <w:r>
-        <w:t xml:space="preserve"> para ser reutilizado en inferencia sin necesidad de reentrenar.</w:t>
+        <w:t>El preprocesador fue serializado en models/preprocessor.joblib para ser reutilizado en inferencia sin necesidad de reentrenar.</w:t>
       </w:r>
     </w:p>
     <w:p>
@@ -2946,15 +2344,7 @@
         <w:spacing w:after="120"/>
       </w:pPr>
       <w:r>
-        <w:t xml:space="preserve">Se utilizó </w:t>
-      </w:r>
-      <w:proofErr w:type="spellStart"/>
-      <w:r>
-        <w:t>train_test_split</w:t>
-      </w:r>
-      <w:proofErr w:type="spellEnd"/>
-      <w:r>
-        <w:t xml:space="preserve"> con los siguientes parámetros:</w:t>
+        <w:t>Se utilizó train_test_split con los siguientes parámetros:</w:t>
       </w:r>
     </w:p>
     <w:p>
@@ -2966,13 +2356,8 @@
         </w:numPr>
         <w:spacing w:after="80"/>
       </w:pPr>
-      <w:proofErr w:type="spellStart"/>
-      <w:r>
-        <w:t>test_size</w:t>
-      </w:r>
-      <w:proofErr w:type="spellEnd"/>
-      <w:r>
-        <w:t xml:space="preserve"> = 0.20 (80% entrenamiento, 20% prueba)</w:t>
+      <w:r>
+        <w:t>test_size = 0.20 (80% entrenamiento, 20% prueba)</w:t>
       </w:r>
     </w:p>
     <w:p>
@@ -2984,13 +2369,8 @@
         </w:numPr>
         <w:spacing w:after="80"/>
       </w:pPr>
-      <w:proofErr w:type="spellStart"/>
-      <w:r>
-        <w:t>random_state</w:t>
-      </w:r>
-      <w:proofErr w:type="spellEnd"/>
-      <w:r>
-        <w:t xml:space="preserve"> = 42 (reproducibilidad)</w:t>
+      <w:r>
+        <w:t>random_state = 42 (reproducibilidad)</w:t>
       </w:r>
     </w:p>
     <w:p>
@@ -3002,21 +2382,8 @@
         </w:numPr>
         <w:spacing w:after="80"/>
       </w:pPr>
-      <w:proofErr w:type="spellStart"/>
-      <w:r>
-        <w:t>stratify</w:t>
-      </w:r>
-      <w:proofErr w:type="spellEnd"/>
-      <w:r>
-        <w:t xml:space="preserve"> = y (mantiene la proporción de </w:t>
-      </w:r>
-      <w:proofErr w:type="spellStart"/>
-      <w:r>
-        <w:t>churn</w:t>
-      </w:r>
-      <w:proofErr w:type="spellEnd"/>
-      <w:r>
-        <w:t xml:space="preserve"> en ambos conjuntos)</w:t>
+      <w:r>
+        <w:t>stratify = y (mantiene la proporción de churn en ambos conjuntos)</w:t>
       </w:r>
     </w:p>
     <w:p>
@@ -3030,15 +2397,7 @@
         <w:jc w:val="both"/>
       </w:pPr>
       <w:r>
-        <w:t xml:space="preserve">Resultado: 4.000 registros para entrenamiento y 1.000 para prueba, con tasa de </w:t>
-      </w:r>
-      <w:proofErr w:type="spellStart"/>
-      <w:r>
-        <w:t>churn</w:t>
-      </w:r>
-      <w:proofErr w:type="spellEnd"/>
-      <w:r>
-        <w:t xml:space="preserve"> de 34.1% y 34.0% respectivamente.</w:t>
+        <w:t>Resultado: 4.000 registros para entrenamiento y 1.000 para prueba, con tasa de churn de 34.1% y 34.0% respectivamente.</w:t>
       </w:r>
     </w:p>
     <w:p>
@@ -3083,31 +2442,7 @@
         <w:spacing w:after="80"/>
       </w:pPr>
       <w:r>
-        <w:t xml:space="preserve">Regresión Logística (C=1.0, </w:t>
-      </w:r>
-      <w:proofErr w:type="spellStart"/>
-      <w:r>
-        <w:t>max_iter</w:t>
-      </w:r>
-      <w:proofErr w:type="spellEnd"/>
-      <w:r>
-        <w:t xml:space="preserve">=500, </w:t>
-      </w:r>
-      <w:proofErr w:type="spellStart"/>
-      <w:r>
-        <w:t>class_weight</w:t>
-      </w:r>
-      <w:proofErr w:type="spellEnd"/>
-      <w:r>
-        <w:t>='</w:t>
-      </w:r>
-      <w:proofErr w:type="spellStart"/>
-      <w:r>
-        <w:t>balanced</w:t>
-      </w:r>
-      <w:proofErr w:type="spellEnd"/>
-      <w:r>
-        <w:t>')</w:t>
+        <w:t>Regresión Logística (C=1.0, max_iter=500, class_weight='balanced')</w:t>
       </w:r>
     </w:p>
     <w:p>
@@ -3120,39 +2455,7 @@
         <w:spacing w:after="80"/>
       </w:pPr>
       <w:r>
-        <w:t>Random Forest (</w:t>
-      </w:r>
-      <w:proofErr w:type="spellStart"/>
-      <w:r>
-        <w:t>n_estimators</w:t>
-      </w:r>
-      <w:proofErr w:type="spellEnd"/>
-      <w:r>
-        <w:t xml:space="preserve">=100, </w:t>
-      </w:r>
-      <w:proofErr w:type="spellStart"/>
-      <w:r>
-        <w:t>max_depth</w:t>
-      </w:r>
-      <w:proofErr w:type="spellEnd"/>
-      <w:r>
-        <w:t xml:space="preserve">=10, </w:t>
-      </w:r>
-      <w:proofErr w:type="spellStart"/>
-      <w:r>
-        <w:t>class_weight</w:t>
-      </w:r>
-      <w:proofErr w:type="spellEnd"/>
-      <w:r>
-        <w:t>='</w:t>
-      </w:r>
-      <w:proofErr w:type="spellStart"/>
-      <w:r>
-        <w:t>balanced</w:t>
-      </w:r>
-      <w:proofErr w:type="spellEnd"/>
-      <w:r>
-        <w:t>')</w:t>
+        <w:t>Random Forest (n_estimators=100, max_depth=10, class_weight='balanced')</w:t>
       </w:r>
     </w:p>
     <w:p>
@@ -3189,12 +2492,6 @@
         <w:gridCol w:w="1426"/>
       </w:tblGrid>
       <w:tr>
-        <w:tblPrEx>
-          <w:tblCellMar>
-            <w:top w:w="0" w:type="dxa"/>
-            <w:bottom w:w="0" w:type="dxa"/>
-          </w:tblCellMar>
-        </w:tblPrEx>
         <w:trPr>
           <w:tblHeader/>
         </w:trPr>
@@ -3252,9 +2549,28 @@
                 <w:sz w:val="20"/>
                 <w:szCs w:val="20"/>
               </w:rPr>
-              <w:t xml:space="preserve">Log. </w:t>
-            </w:r>
-            <w:proofErr w:type="spellStart"/>
+              <w:t>Log. Regression</w:t>
+            </w:r>
+          </w:p>
+        </w:tc>
+        <w:tc>
+          <w:tcPr>
+            <w:tcW w:w="1700" w:type="dxa"/>
+            <w:tcBorders>
+              <w:top w:val="single" w:sz="1" w:space="0" w:color="CCCCCC"/>
+              <w:left w:val="single" w:sz="1" w:space="0" w:color="CCCCCC"/>
+              <w:bottom w:val="single" w:sz="1" w:space="0" w:color="CCCCCC"/>
+              <w:right w:val="single" w:sz="1" w:space="0" w:color="CCCCCC"/>
+            </w:tcBorders>
+            <w:shd w:val="clear" w:color="auto" w:fill="D6E4F0"/>
+            <w:tcMar>
+              <w:top w:w="80" w:type="dxa"/>
+              <w:left w:w="120" w:type="dxa"/>
+              <w:bottom w:w="80" w:type="dxa"/>
+              <w:right w:w="120" w:type="dxa"/>
+            </w:tcMar>
+          </w:tcPr>
+          <w:p>
             <w:r>
               <w:rPr>
                 <w:b/>
@@ -3262,9 +2578,8 @@
                 <w:sz w:val="20"/>
                 <w:szCs w:val="20"/>
               </w:rPr>
-              <w:t>Regression</w:t>
-            </w:r>
-            <w:proofErr w:type="spellEnd"/>
+              <w:t>Random Forest</w:t>
+            </w:r>
           </w:p>
         </w:tc>
         <w:tc>
@@ -3292,13 +2607,13 @@
                 <w:sz w:val="20"/>
                 <w:szCs w:val="20"/>
               </w:rPr>
-              <w:t>Random Forest</w:t>
-            </w:r>
-          </w:p>
-        </w:tc>
-        <w:tc>
-          <w:tcPr>
-            <w:tcW w:w="1700" w:type="dxa"/>
+              <w:t>Mejor modelo</w:t>
+            </w:r>
+          </w:p>
+        </w:tc>
+        <w:tc>
+          <w:tcPr>
+            <w:tcW w:w="1426" w:type="dxa"/>
             <w:tcBorders>
               <w:top w:val="single" w:sz="1" w:space="0" w:color="CCCCCC"/>
               <w:left w:val="single" w:sz="1" w:space="0" w:color="CCCCCC"/>
@@ -3321,47 +2636,12 @@
                 <w:sz w:val="20"/>
                 <w:szCs w:val="20"/>
               </w:rPr>
-              <w:t>Mejor modelo</w:t>
-            </w:r>
-          </w:p>
-        </w:tc>
-        <w:tc>
-          <w:tcPr>
-            <w:tcW w:w="1426" w:type="dxa"/>
-            <w:tcBorders>
-              <w:top w:val="single" w:sz="1" w:space="0" w:color="CCCCCC"/>
-              <w:left w:val="single" w:sz="1" w:space="0" w:color="CCCCCC"/>
-              <w:bottom w:val="single" w:sz="1" w:space="0" w:color="CCCCCC"/>
-              <w:right w:val="single" w:sz="1" w:space="0" w:color="CCCCCC"/>
-            </w:tcBorders>
-            <w:shd w:val="clear" w:color="auto" w:fill="D6E4F0"/>
-            <w:tcMar>
-              <w:top w:w="80" w:type="dxa"/>
-              <w:left w:w="120" w:type="dxa"/>
-              <w:bottom w:w="80" w:type="dxa"/>
-              <w:right w:w="120" w:type="dxa"/>
-            </w:tcMar>
-          </w:tcPr>
-          <w:p>
-            <w:r>
-              <w:rPr>
-                <w:b/>
-                <w:bCs/>
-                <w:sz w:val="20"/>
-                <w:szCs w:val="20"/>
-              </w:rPr>
               <w:t>Criterio</w:t>
             </w:r>
           </w:p>
         </w:tc>
       </w:tr>
       <w:tr>
-        <w:tblPrEx>
-          <w:tblCellMar>
-            <w:top w:w="0" w:type="dxa"/>
-            <w:bottom w:w="0" w:type="dxa"/>
-          </w:tblCellMar>
-        </w:tblPrEx>
         <w:tc>
           <w:tcPr>
             <w:tcW w:w="2500" w:type="dxa"/>
@@ -3380,7 +2660,6 @@
             </w:tcMar>
           </w:tcPr>
           <w:p>
-            <w:proofErr w:type="spellStart"/>
             <w:r>
               <w:rPr>
                 <w:sz w:val="20"/>
@@ -3388,7 +2667,6 @@
               </w:rPr>
               <w:t>Accuracy</w:t>
             </w:r>
-            <w:proofErr w:type="spellEnd"/>
           </w:p>
         </w:tc>
         <w:tc>
@@ -3501,12 +2779,6 @@
         </w:tc>
       </w:tr>
       <w:tr>
-        <w:tblPrEx>
-          <w:tblCellMar>
-            <w:top w:w="0" w:type="dxa"/>
-            <w:bottom w:w="0" w:type="dxa"/>
-          </w:tblCellMar>
-        </w:tblPrEx>
         <w:tc>
           <w:tcPr>
             <w:tcW w:w="2500" w:type="dxa"/>
@@ -3525,7 +2797,6 @@
             </w:tcMar>
           </w:tcPr>
           <w:p>
-            <w:proofErr w:type="spellStart"/>
             <w:r>
               <w:rPr>
                 <w:sz w:val="20"/>
@@ -3533,7 +2804,6 @@
               </w:rPr>
               <w:t>Precision</w:t>
             </w:r>
-            <w:proofErr w:type="spellEnd"/>
           </w:p>
         </w:tc>
         <w:tc>
@@ -3646,12 +2916,6 @@
         </w:tc>
       </w:tr>
       <w:tr>
-        <w:tblPrEx>
-          <w:tblCellMar>
-            <w:top w:w="0" w:type="dxa"/>
-            <w:bottom w:w="0" w:type="dxa"/>
-          </w:tblCellMar>
-        </w:tblPrEx>
         <w:tc>
           <w:tcPr>
             <w:tcW w:w="2500" w:type="dxa"/>
@@ -3670,7 +2934,6 @@
             </w:tcMar>
           </w:tcPr>
           <w:p>
-            <w:proofErr w:type="spellStart"/>
             <w:r>
               <w:rPr>
                 <w:sz w:val="20"/>
@@ -3678,7 +2941,6 @@
               </w:rPr>
               <w:t>Recall</w:t>
             </w:r>
-            <w:proofErr w:type="spellEnd"/>
           </w:p>
         </w:tc>
         <w:tc>
@@ -3758,17 +3020,8 @@
                 <w:sz w:val="20"/>
                 <w:szCs w:val="20"/>
               </w:rPr>
-              <w:t xml:space="preserve">Log. </w:t>
-            </w:r>
-            <w:proofErr w:type="spellStart"/>
-            <w:r>
-              <w:rPr>
-                <w:sz w:val="20"/>
-                <w:szCs w:val="20"/>
-              </w:rPr>
-              <w:t>Regression</w:t>
-            </w:r>
-            <w:proofErr w:type="spellEnd"/>
+              <w:t>Log. Regression</w:t>
+            </w:r>
           </w:p>
         </w:tc>
         <w:tc>
@@ -3800,12 +3053,6 @@
         </w:tc>
       </w:tr>
       <w:tr>
-        <w:tblPrEx>
-          <w:tblCellMar>
-            <w:top w:w="0" w:type="dxa"/>
-            <w:bottom w:w="0" w:type="dxa"/>
-          </w:tblCellMar>
-        </w:tblPrEx>
         <w:tc>
           <w:tcPr>
             <w:tcW w:w="2500" w:type="dxa"/>
@@ -3910,17 +3157,8 @@
                 <w:sz w:val="20"/>
                 <w:szCs w:val="20"/>
               </w:rPr>
-              <w:t xml:space="preserve">Log. </w:t>
-            </w:r>
-            <w:proofErr w:type="spellStart"/>
-            <w:r>
-              <w:rPr>
-                <w:sz w:val="20"/>
-                <w:szCs w:val="20"/>
-              </w:rPr>
-              <w:t>Regression</w:t>
-            </w:r>
-            <w:proofErr w:type="spellEnd"/>
+              <w:t>Log. Regression</w:t>
+            </w:r>
           </w:p>
         </w:tc>
         <w:tc>
@@ -3952,12 +3190,6 @@
         </w:tc>
       </w:tr>
       <w:tr>
-        <w:tblPrEx>
-          <w:tblCellMar>
-            <w:top w:w="0" w:type="dxa"/>
-            <w:bottom w:w="0" w:type="dxa"/>
-          </w:tblCellMar>
-        </w:tblPrEx>
         <w:tc>
           <w:tcPr>
             <w:tcW w:w="2500" w:type="dxa"/>
@@ -4062,17 +3294,8 @@
                 <w:sz w:val="20"/>
                 <w:szCs w:val="20"/>
               </w:rPr>
-              <w:t xml:space="preserve">Log. </w:t>
-            </w:r>
-            <w:proofErr w:type="spellStart"/>
-            <w:r>
-              <w:rPr>
-                <w:sz w:val="20"/>
-                <w:szCs w:val="20"/>
-              </w:rPr>
-              <w:t>Regression</w:t>
-            </w:r>
-            <w:proofErr w:type="spellEnd"/>
+              <w:t>Log. Regression</w:t>
+            </w:r>
           </w:p>
         </w:tc>
         <w:tc>
@@ -4123,23 +3346,7 @@
         <w:jc w:val="both"/>
       </w:pPr>
       <w:r>
-        <w:t xml:space="preserve">Se seleccionó la Regresión Logística como modelo final con base en el mayor ROC-AUC (0.758). Esta métrica fue </w:t>
-      </w:r>
-      <w:proofErr w:type="gramStart"/>
-      <w:r>
-        <w:t>elegida como</w:t>
-      </w:r>
-      <w:proofErr w:type="gramEnd"/>
-      <w:r>
-        <w:t xml:space="preserve"> criterio principal porque evalúa la capacidad discriminante del modelo en todos los umbrales de clasificación posibles, siendo más robusta que el </w:t>
-      </w:r>
-      <w:proofErr w:type="spellStart"/>
-      <w:r>
-        <w:t>accuracy</w:t>
-      </w:r>
-      <w:proofErr w:type="spellEnd"/>
-      <w:r>
-        <w:t xml:space="preserve"> ante el desbalance de clases.</w:t>
+        <w:t>Se seleccionó la Regresión Logística como modelo final con base en el mayor ROC-AUC (0.758). Esta métrica fue elegida como criterio principal porque evalúa la capacidad discriminante del modelo en todos los umbrales de clasificación posibles, siendo más robusta que el accuracy ante el desbalance de clases.</w:t>
       </w:r>
     </w:p>
     <w:p>
@@ -4148,23 +3355,7 @@
         <w:jc w:val="both"/>
       </w:pPr>
       <w:r>
-        <w:t xml:space="preserve">Adicionalmente, la Regresión Logística obtuvo mayor </w:t>
-      </w:r>
-      <w:proofErr w:type="spellStart"/>
-      <w:r>
-        <w:t>recall</w:t>
-      </w:r>
-      <w:proofErr w:type="spellEnd"/>
-      <w:r>
-        <w:t xml:space="preserve"> (0.729 vs 0.609), lo que es especialmente relevante para el caso de </w:t>
-      </w:r>
-      <w:proofErr w:type="spellStart"/>
-      <w:r>
-        <w:t>churn</w:t>
-      </w:r>
-      <w:proofErr w:type="spellEnd"/>
-      <w:r>
-        <w:t>: es preferible identificar correctamente a los clientes que van a abandonar (aunque se generen algunas falsas alarmas) que perder clientes reales por no detectarlos.</w:t>
+        <w:t>Adicionalmente, la Regresión Logística obtuvo mayor recall (0.729 vs 0.609), lo que es especialmente relevante para el caso de churn: es preferible identificar correctamente a los clientes que van a abandonar (aunque se generen algunas falsas alarmas) que perder clientes reales por no detectarlos.</w:t>
       </w:r>
     </w:p>
     <w:p>
@@ -4185,21 +3376,8 @@
         <w:spacing w:after="80"/>
       </w:pPr>
       <w:r>
-        <w:t xml:space="preserve">Modelo final: </w:t>
-      </w:r>
-      <w:proofErr w:type="spellStart"/>
-      <w:r>
-        <w:t>models</w:t>
-      </w:r>
-      <w:proofErr w:type="spellEnd"/>
-      <w:r>
-        <w:t>/</w:t>
-      </w:r>
-      <w:proofErr w:type="spellStart"/>
-      <w:r>
-        <w:t>best_model.joblib</w:t>
-      </w:r>
-      <w:proofErr w:type="spellEnd"/>
+        <w:t>Modelo final: models/best_model.joblib</w:t>
+      </w:r>
     </w:p>
     <w:p>
       <w:pPr>
@@ -4211,21 +3389,8 @@
         <w:spacing w:after="80"/>
       </w:pPr>
       <w:r>
-        <w:t xml:space="preserve">Pipeline de preprocesamiento: </w:t>
-      </w:r>
-      <w:proofErr w:type="spellStart"/>
-      <w:r>
-        <w:t>models</w:t>
-      </w:r>
-      <w:proofErr w:type="spellEnd"/>
-      <w:r>
-        <w:t>/</w:t>
-      </w:r>
-      <w:proofErr w:type="spellStart"/>
-      <w:r>
-        <w:t>preprocessor.joblib</w:t>
-      </w:r>
-      <w:proofErr w:type="spellEnd"/>
+        <w:t>Pipeline de preprocesamiento: models/preprocessor.joblib</w:t>
+      </w:r>
     </w:p>
     <w:p>
       <w:pPr>
@@ -4261,13 +3426,8 @@
         <w:pStyle w:val="Ttulo2"/>
       </w:pPr>
       <w:r>
-        <w:t xml:space="preserve">6.1 </w:t>
-      </w:r>
-      <w:proofErr w:type="spellStart"/>
-      <w:r>
-        <w:t>MLflow</w:t>
-      </w:r>
-      <w:proofErr w:type="spellEnd"/>
+        <w:t>6.1 MLflow</w:t>
+      </w:r>
     </w:p>
     <w:p>
       <w:pPr>
@@ -4275,54 +3435,13 @@
         <w:jc w:val="both"/>
       </w:pPr>
       <w:r>
-        <w:t xml:space="preserve">Todos los experimentos fueron registrados con </w:t>
-      </w:r>
-      <w:proofErr w:type="spellStart"/>
-      <w:r>
-        <w:t>MLflow</w:t>
-      </w:r>
-      <w:proofErr w:type="spellEnd"/>
-      <w:r>
-        <w:t xml:space="preserve">, incluyendo parámetros, métricas y artefactos de cada run. La base de datos de experimentos se almacena en </w:t>
-      </w:r>
-      <w:proofErr w:type="spellStart"/>
-      <w:r>
-        <w:t>mlflow.db</w:t>
-      </w:r>
-      <w:proofErr w:type="spellEnd"/>
-      <w:r>
-        <w:t xml:space="preserve"> y el directorio </w:t>
-      </w:r>
-      <w:proofErr w:type="spellStart"/>
-      <w:r>
-        <w:t>mlruns</w:t>
-      </w:r>
-      <w:proofErr w:type="spellEnd"/>
-      <w:r>
-        <w:t xml:space="preserve">/ contiene 4 </w:t>
-      </w:r>
-      <w:proofErr w:type="spellStart"/>
-      <w:r>
-        <w:t>runs</w:t>
-      </w:r>
-      <w:proofErr w:type="spellEnd"/>
-      <w:r>
-        <w:t xml:space="preserve"> con sus respectivos modelos registrados. El </w:t>
-      </w:r>
-      <w:proofErr w:type="spellStart"/>
-      <w:r>
-        <w:t>dashboard</w:t>
-      </w:r>
-      <w:proofErr w:type="spellEnd"/>
-      <w:r>
-        <w:t xml:space="preserve"> puede visualizarse con:</w:t>
+        <w:t>Todos los experimentos fueron registrados con MLflow, incluyendo parámetros, métricas y artefactos de cada run. La base de datos de experimentos se almacena en mlflow.db y el directorio mlruns/ contiene 4 runs con sus respectivos modelos registrados. El dashboard puede visualizarse con:</w:t>
       </w:r>
     </w:p>
     <w:p>
       <w:pPr>
         <w:spacing w:after="120"/>
       </w:pPr>
-      <w:proofErr w:type="spellStart"/>
       <w:r>
         <w:rPr>
           <w:rFonts w:ascii="Courier New" w:eastAsia="Courier New" w:hAnsi="Courier New" w:cs="Courier New"/>
@@ -4330,9 +3449,30 @@
           <w:sz w:val="20"/>
           <w:szCs w:val="20"/>
         </w:rPr>
-        <w:t>mlflow</w:t>
-      </w:r>
-      <w:proofErr w:type="spellEnd"/>
+        <w:t>mlflow ui --backend-store-uri sqlite:///mlflow.db</w:t>
+      </w:r>
+    </w:p>
+    <w:p>
+      <w:pPr>
+        <w:pStyle w:val="Ttulo2"/>
+      </w:pPr>
+      <w:r>
+        <w:t>6.2 DVC</w:t>
+      </w:r>
+    </w:p>
+    <w:p>
+      <w:pPr>
+        <w:spacing w:after="120"/>
+        <w:jc w:val="both"/>
+      </w:pPr>
+      <w:r>
+        <w:t>El pipeline de datos y entrenamiento está definido en dvc.yaml con dos stages: preprocess y train. Cada stage declara sus dependencias, parámetros de params.yaml y outputs, permitiendo detectar cambios y reproducir el pipeline con:</w:t>
+      </w:r>
+    </w:p>
+    <w:p>
+      <w:pPr>
+        <w:spacing w:after="120"/>
+      </w:pPr>
       <w:r>
         <w:rPr>
           <w:rFonts w:ascii="Courier New" w:eastAsia="Courier New" w:hAnsi="Courier New" w:cs="Courier New"/>
@@ -4340,67 +3480,7 @@
           <w:sz w:val="20"/>
           <w:szCs w:val="20"/>
         </w:rPr>
-        <w:t xml:space="preserve"> </w:t>
-      </w:r>
-      <w:proofErr w:type="spellStart"/>
-      <w:r>
-        <w:rPr>
-          <w:rFonts w:ascii="Courier New" w:eastAsia="Courier New" w:hAnsi="Courier New" w:cs="Courier New"/>
-          <w:color w:val="333333"/>
-          <w:sz w:val="20"/>
-          <w:szCs w:val="20"/>
-        </w:rPr>
-        <w:t>ui</w:t>
-      </w:r>
-      <w:proofErr w:type="spellEnd"/>
-      <w:r>
-        <w:rPr>
-          <w:rFonts w:ascii="Courier New" w:eastAsia="Courier New" w:hAnsi="Courier New" w:cs="Courier New"/>
-          <w:color w:val="333333"/>
-          <w:sz w:val="20"/>
-          <w:szCs w:val="20"/>
-        </w:rPr>
-        <w:t xml:space="preserve"> --</w:t>
-      </w:r>
-      <w:proofErr w:type="spellStart"/>
-      <w:r>
-        <w:rPr>
-          <w:rFonts w:ascii="Courier New" w:eastAsia="Courier New" w:hAnsi="Courier New" w:cs="Courier New"/>
-          <w:color w:val="333333"/>
-          <w:sz w:val="20"/>
-          <w:szCs w:val="20"/>
-        </w:rPr>
-        <w:t>backend</w:t>
-      </w:r>
-      <w:proofErr w:type="spellEnd"/>
-      <w:r>
-        <w:rPr>
-          <w:rFonts w:ascii="Courier New" w:eastAsia="Courier New" w:hAnsi="Courier New" w:cs="Courier New"/>
-          <w:color w:val="333333"/>
-          <w:sz w:val="20"/>
-          <w:szCs w:val="20"/>
-        </w:rPr>
-        <w:t>-store-</w:t>
-      </w:r>
-      <w:proofErr w:type="spellStart"/>
-      <w:r>
-        <w:rPr>
-          <w:rFonts w:ascii="Courier New" w:eastAsia="Courier New" w:hAnsi="Courier New" w:cs="Courier New"/>
-          <w:color w:val="333333"/>
-          <w:sz w:val="20"/>
-          <w:szCs w:val="20"/>
-        </w:rPr>
-        <w:t>uri</w:t>
-      </w:r>
-      <w:proofErr w:type="spellEnd"/>
-      <w:r>
-        <w:rPr>
-          <w:rFonts w:ascii="Courier New" w:eastAsia="Courier New" w:hAnsi="Courier New" w:cs="Courier New"/>
-          <w:color w:val="333333"/>
-          <w:sz w:val="20"/>
-          <w:szCs w:val="20"/>
-        </w:rPr>
-        <w:t xml:space="preserve"> sqlite:///mlflow.db</w:t>
+        <w:t>dvc repro</w:t>
       </w:r>
     </w:p>
     <w:p>
@@ -4408,7 +3488,7 @@
         <w:pStyle w:val="Ttulo2"/>
       </w:pPr>
       <w:r>
-        <w:t>6.2 DVC</w:t>
+        <w:t>6.3 Git</w:t>
       </w:r>
     </w:p>
     <w:p>
@@ -4417,126 +3497,8 @@
         <w:jc w:val="both"/>
       </w:pPr>
       <w:r>
-        <w:t xml:space="preserve">El pipeline de datos y entrenamiento está definido en </w:t>
-      </w:r>
-      <w:proofErr w:type="spellStart"/>
-      <w:proofErr w:type="gramStart"/>
-      <w:r>
-        <w:t>dvc.yaml</w:t>
-      </w:r>
-      <w:proofErr w:type="spellEnd"/>
-      <w:proofErr w:type="gramEnd"/>
-      <w:r>
-        <w:t xml:space="preserve"> con dos </w:t>
-      </w:r>
-      <w:proofErr w:type="spellStart"/>
-      <w:r>
-        <w:t>stages</w:t>
-      </w:r>
-      <w:proofErr w:type="spellEnd"/>
-      <w:r>
-        <w:t xml:space="preserve">: </w:t>
-      </w:r>
-      <w:proofErr w:type="spellStart"/>
-      <w:r>
-        <w:t>preprocess</w:t>
-      </w:r>
-      <w:proofErr w:type="spellEnd"/>
-      <w:r>
-        <w:t xml:space="preserve"> y </w:t>
-      </w:r>
-      <w:proofErr w:type="spellStart"/>
-      <w:r>
-        <w:t>train</w:t>
-      </w:r>
-      <w:proofErr w:type="spellEnd"/>
-      <w:r>
-        <w:t xml:space="preserve">. Cada </w:t>
-      </w:r>
-      <w:proofErr w:type="spellStart"/>
-      <w:r>
-        <w:t>stage</w:t>
-      </w:r>
-      <w:proofErr w:type="spellEnd"/>
-      <w:r>
-        <w:t xml:space="preserve"> declara sus dependencias, parámetros de </w:t>
-      </w:r>
-      <w:proofErr w:type="spellStart"/>
-      <w:proofErr w:type="gramStart"/>
-      <w:r>
-        <w:t>params.yaml</w:t>
-      </w:r>
-      <w:proofErr w:type="spellEnd"/>
-      <w:proofErr w:type="gramEnd"/>
-      <w:r>
-        <w:t xml:space="preserve"> y outputs, permitiendo detectar cambios y reproducir el pipeline con:</w:t>
-      </w:r>
-    </w:p>
-    <w:p>
-      <w:pPr>
-        <w:spacing w:after="120"/>
-      </w:pPr>
-      <w:proofErr w:type="spellStart"/>
-      <w:r>
-        <w:rPr>
-          <w:rFonts w:ascii="Courier New" w:eastAsia="Courier New" w:hAnsi="Courier New" w:cs="Courier New"/>
-          <w:color w:val="333333"/>
-          <w:sz w:val="20"/>
-          <w:szCs w:val="20"/>
-        </w:rPr>
-        <w:t>dvc</w:t>
-      </w:r>
-      <w:proofErr w:type="spellEnd"/>
-      <w:r>
-        <w:rPr>
-          <w:rFonts w:ascii="Courier New" w:eastAsia="Courier New" w:hAnsi="Courier New" w:cs="Courier New"/>
-          <w:color w:val="333333"/>
-          <w:sz w:val="20"/>
-          <w:szCs w:val="20"/>
-        </w:rPr>
-        <w:t xml:space="preserve"> </w:t>
-      </w:r>
-      <w:proofErr w:type="spellStart"/>
-      <w:r>
-        <w:rPr>
-          <w:rFonts w:ascii="Courier New" w:eastAsia="Courier New" w:hAnsi="Courier New" w:cs="Courier New"/>
-          <w:color w:val="333333"/>
-          <w:sz w:val="20"/>
-          <w:szCs w:val="20"/>
-        </w:rPr>
-        <w:t>repro</w:t>
-      </w:r>
-      <w:proofErr w:type="spellEnd"/>
-    </w:p>
-    <w:p>
-      <w:pPr>
-        <w:pStyle w:val="Ttulo2"/>
-      </w:pPr>
-      <w:r>
-        <w:t>6.3 Git</w:t>
-      </w:r>
-    </w:p>
-    <w:p>
-      <w:pPr>
-        <w:spacing w:after="120"/>
-        <w:jc w:val="both"/>
-      </w:pPr>
-      <w:r>
         <w:lastRenderedPageBreak/>
-        <w:t xml:space="preserve">El proyecto está versionado con Git. El repositorio </w:t>
-      </w:r>
-      <w:proofErr w:type="gramStart"/>
-      <w:r>
-        <w:t>incluye .</w:t>
-      </w:r>
-      <w:proofErr w:type="spellStart"/>
-      <w:r>
-        <w:t>gitignore</w:t>
-      </w:r>
-      <w:proofErr w:type="spellEnd"/>
-      <w:proofErr w:type="gramEnd"/>
-      <w:r>
-        <w:t xml:space="preserve"> para excluir entornos virtuales, artefactos generados y archivos temporales.</w:t>
+        <w:t>El proyecto está versionado con Git. El repositorio incluye .gitignore para excluir entornos virtuales, artefactos generados y archivos temporales.</w:t>
       </w:r>
     </w:p>
     <w:p>
@@ -4573,15 +3535,7 @@
         <w:spacing w:after="80"/>
       </w:pPr>
       <w:r>
-        <w:t xml:space="preserve">El modelo de Regresión Logística alcanzó un ROC-AUC de 0.758, demostrando capacidad discriminante aceptable para el problema de </w:t>
-      </w:r>
-      <w:proofErr w:type="spellStart"/>
-      <w:r>
-        <w:t>churn</w:t>
-      </w:r>
-      <w:proofErr w:type="spellEnd"/>
-      <w:r>
-        <w:t>.</w:t>
+        <w:t>El modelo de Regresión Logística alcanzó un ROC-AUC de 0.758, demostrando capacidad discriminante aceptable para el problema de churn.</w:t>
       </w:r>
     </w:p>
     <w:p>
@@ -4607,15 +3561,7 @@
         <w:spacing w:after="80"/>
       </w:pPr>
       <w:r>
-        <w:t xml:space="preserve">El pipeline de preprocesamiento es reproducible y reutilizable en inferencia gracias a la serialización del </w:t>
-      </w:r>
-      <w:proofErr w:type="spellStart"/>
-      <w:r>
-        <w:t>ColumnTransformer</w:t>
-      </w:r>
-      <w:proofErr w:type="spellEnd"/>
-      <w:r>
-        <w:t>.</w:t>
+        <w:t>El pipeline de preprocesamiento es reproducible y reutilizable en inferencia gracias a la serialización del ColumnTransformer.</w:t>
       </w:r>
     </w:p>
     <w:p>
@@ -4628,15 +3574,7 @@
         <w:spacing w:after="80"/>
       </w:pPr>
       <w:r>
-        <w:t xml:space="preserve">La integración con </w:t>
-      </w:r>
-      <w:proofErr w:type="spellStart"/>
-      <w:r>
-        <w:t>MLflow</w:t>
-      </w:r>
-      <w:proofErr w:type="spellEnd"/>
-      <w:r>
-        <w:t xml:space="preserve"> garantiza trazabilidad completa de los experimentos realizados.</w:t>
+        <w:t>La integración con MLflow garantiza trazabilidad completa de los experimentos realizados.</w:t>
       </w:r>
     </w:p>
     <w:p>
@@ -4657,23 +3595,7 @@
         <w:spacing w:after="80"/>
       </w:pPr>
       <w:r>
-        <w:t xml:space="preserve">El </w:t>
-      </w:r>
-      <w:proofErr w:type="spellStart"/>
-      <w:r>
-        <w:t>dataset</w:t>
-      </w:r>
-      <w:proofErr w:type="spellEnd"/>
-      <w:r>
-        <w:t xml:space="preserve"> es sintético, por lo que el modelo no ha sido validado con datos reales de </w:t>
-      </w:r>
-      <w:proofErr w:type="spellStart"/>
-      <w:r>
-        <w:t>AndesLink</w:t>
-      </w:r>
-      <w:proofErr w:type="spellEnd"/>
-      <w:r>
-        <w:t>.</w:t>
+        <w:t>El dataset es sintético, por lo que el modelo no ha sido validado con datos reales de AndesLink.</w:t>
       </w:r>
     </w:p>
     <w:p>
@@ -4686,31 +3608,7 @@
         <w:spacing w:after="80"/>
       </w:pPr>
       <w:r>
-        <w:t xml:space="preserve">No se realizó búsqueda de </w:t>
-      </w:r>
-      <w:proofErr w:type="spellStart"/>
-      <w:r>
-        <w:t>hiperparámetros</w:t>
-      </w:r>
-      <w:proofErr w:type="spellEnd"/>
-      <w:r>
-        <w:t xml:space="preserve"> (</w:t>
-      </w:r>
-      <w:proofErr w:type="spellStart"/>
-      <w:r>
-        <w:t>GridSearch</w:t>
-      </w:r>
-      <w:proofErr w:type="spellEnd"/>
-      <w:r>
-        <w:t xml:space="preserve"> / </w:t>
-      </w:r>
-      <w:proofErr w:type="spellStart"/>
-      <w:r>
-        <w:t>RandomizedSearch</w:t>
-      </w:r>
-      <w:proofErr w:type="spellEnd"/>
-      <w:r>
-        <w:t>) por limitaciones de alcance del primer parcial.</w:t>
+        <w:t>No se realizó búsqueda de hiperparámetros (GridSearch / RandomizedSearch) por limitaciones de alcance del primer parcial.</w:t>
       </w:r>
     </w:p>
     <w:p>
@@ -4736,15 +3634,7 @@
         <w:spacing w:after="80"/>
       </w:pPr>
       <w:r>
-        <w:t xml:space="preserve">El umbral de clasificación (0.5 por defecto) no fue optimizado para el contexto de negocio; podría ajustarse para maximizar </w:t>
-      </w:r>
-      <w:proofErr w:type="spellStart"/>
-      <w:r>
-        <w:t>recall</w:t>
-      </w:r>
-      <w:proofErr w:type="spellEnd"/>
-      <w:r>
-        <w:t>.</w:t>
+        <w:t>El umbral de clasificación (0.5 por defecto) no fue optimizado para el contexto de negocio; podría ajustarse para maximizar recall.</w:t>
       </w:r>
     </w:p>
     <w:p>
@@ -4760,59 +3650,13 @@
         <w:spacing w:before="400"/>
         <w:jc w:val="center"/>
       </w:pPr>
-      <w:proofErr w:type="spellStart"/>
       <w:r>
         <w:rPr>
           <w:color w:val="888888"/>
           <w:sz w:val="18"/>
           <w:szCs w:val="18"/>
         </w:rPr>
-        <w:t>AndesLink</w:t>
-      </w:r>
-      <w:proofErr w:type="spellEnd"/>
-      <w:r>
-        <w:rPr>
-          <w:color w:val="888888"/>
-          <w:sz w:val="18"/>
-          <w:szCs w:val="18"/>
-        </w:rPr>
-        <w:t xml:space="preserve"> Servicios Digitales S.A.  </w:t>
-      </w:r>
-      <w:proofErr w:type="gramStart"/>
-      <w:r>
-        <w:rPr>
-          <w:color w:val="888888"/>
-          <w:sz w:val="18"/>
-          <w:szCs w:val="18"/>
-        </w:rPr>
-        <w:t>·  ISTEA</w:t>
-      </w:r>
-      <w:proofErr w:type="gramEnd"/>
-      <w:r>
-        <w:rPr>
-          <w:color w:val="888888"/>
-          <w:sz w:val="18"/>
-          <w:szCs w:val="18"/>
-        </w:rPr>
-        <w:t xml:space="preserve"> Laboratorio de Minería de </w:t>
-      </w:r>
-      <w:proofErr w:type="gramStart"/>
-      <w:r>
-        <w:rPr>
-          <w:color w:val="888888"/>
-          <w:sz w:val="18"/>
-          <w:szCs w:val="18"/>
-        </w:rPr>
-        <w:t>Datos  ·</w:t>
-      </w:r>
-      <w:proofErr w:type="gramEnd"/>
-      <w:r>
-        <w:rPr>
-          <w:color w:val="888888"/>
-          <w:sz w:val="18"/>
-          <w:szCs w:val="18"/>
-        </w:rPr>
-        <w:t xml:space="preserve">  2025</w:t>
+        <w:t>AndesLink Servicios Digitales S.A.  ·  ISTEA Laboratorio de Minería de Datos  ·  2025</w:t>
       </w:r>
     </w:p>
     <w:sectPr>
@@ -4851,59 +3695,13 @@
     <w:pPr>
       <w:jc w:val="right"/>
     </w:pPr>
-    <w:proofErr w:type="spellStart"/>
     <w:r>
       <w:rPr>
         <w:color w:val="888888"/>
         <w:sz w:val="18"/>
         <w:szCs w:val="18"/>
       </w:rPr>
-      <w:t>AndesLink</w:t>
-    </w:r>
-    <w:proofErr w:type="spellEnd"/>
-    <w:r>
-      <w:rPr>
-        <w:color w:val="888888"/>
-        <w:sz w:val="18"/>
-        <w:szCs w:val="18"/>
-      </w:rPr>
-      <w:t xml:space="preserve"> </w:t>
-    </w:r>
-    <w:proofErr w:type="spellStart"/>
-    <w:r>
-      <w:rPr>
-        <w:color w:val="888888"/>
-        <w:sz w:val="18"/>
-        <w:szCs w:val="18"/>
-      </w:rPr>
-      <w:t>MLOps</w:t>
-    </w:r>
-    <w:proofErr w:type="spellEnd"/>
-    <w:r>
-      <w:rPr>
-        <w:color w:val="888888"/>
-        <w:sz w:val="18"/>
-        <w:szCs w:val="18"/>
-      </w:rPr>
-      <w:t xml:space="preserve"> — Informe Técnico Primer </w:t>
-    </w:r>
-    <w:proofErr w:type="gramStart"/>
-    <w:r>
-      <w:rPr>
-        <w:color w:val="888888"/>
-        <w:sz w:val="18"/>
-        <w:szCs w:val="18"/>
-      </w:rPr>
-      <w:t>Parcial  |</w:t>
-    </w:r>
-    <w:proofErr w:type="gramEnd"/>
-    <w:r>
-      <w:rPr>
-        <w:color w:val="888888"/>
-        <w:sz w:val="18"/>
-        <w:szCs w:val="18"/>
-      </w:rPr>
-      <w:t xml:space="preserve">  Pág. </w:t>
+      <w:t xml:space="preserve">AndesLink MLOps — Informe Técnico Primer Parcial  |  Pág. </w:t>
     </w:r>
     <w:r>
       <w:rPr>

</xml_diff>